<commit_message>
Add the student's reflection to report v07
Record the confirmed title and accepted PDF format.

Co-Authored-By: Claude Opus 5.5 <noreply@anthropic.com>
</commit_message>
<xml_diff>
--- a/submission/final_v07_2026-10-30/LolAi_FinalReport_v07.docx
+++ b/submission/final_v07_2026-10-30/LolAi_FinalReport_v07.docx
@@ -8477,23 +8477,129 @@
       <w:pPr>
         <w:jc w:val="both"/>
         <w:rPr>
-          <w:lang w:eastAsia="ko-KR"/>
-        </w:rPr>
-      </w:pPr>
-      <w:r>
-        <w:rPr>
           <w:rFonts w:cs="맑은 고딕"/>
           <w:lang w:eastAsia="ko-KR"/>
         </w:rPr>
-        <w:t xml:space="preserve">이전에 로컬에서 구현했던 프로그램과 자료를 잃은 뒤 현재 환경에서 재구성하였다. 기억에 남은 과거 결과와 이번에 파일·로그로 확인할 수 있는 결과를 분리하는 일이 중요했다. AI 코딩 도구의 도움을 받아 기능과 검사를 확장했고, 정상 터미널에서 전체 </w:t>
+      </w:pPr>
+      <w:r>
+        <w:rPr>
+          <w:rFonts w:cs="맑은 고딕" w:hint="eastAsia"/>
+          <w:lang w:eastAsia="ko-KR"/>
+        </w:rPr>
+        <w:t>처음에는</w:t>
       </w:r>
       <w:r>
         <w:rPr>
           <w:rFonts w:cs="맑은 고딕"/>
           <w:lang w:eastAsia="ko-KR"/>
         </w:rPr>
+        <w:t xml:space="preserve"> 주제를 정하지 못해 고민이 많았고, 솔직히 특별히 하고 싶은 것도 관심 가는 것도 없었다. 그때 떠올린 것이 정말 많이 하고 좋아했던 리그 오브 레전드였다. 사람들은 보통 OP.GG, FOW, Blitz를 사용했는데, 특정한 기준과 안내를 담은 나만의 개인용 버전을 만들 수 있지 않을까 생각했다. 당시는 코로나 시기로 챔피언 선택과 아이템 </w:t>
+      </w:r>
+      <w:r>
+        <w:rPr>
+          <w:rFonts w:cs="맑은 고딕"/>
+          <w:lang w:eastAsia="ko-KR"/>
+        </w:rPr>
         <w:lastRenderedPageBreak/>
-        <w:t>검사를 실행해 동작을 확인하였다. 예측 숫자 하나를 보여 주는 것보다 자료의 출처, 조언이 나온 근거, 실제로 확인하지 못한 한계를 설명해야 한다는 점을 경험하였다.</w:t>
+        <w:t>구매를 알려 주는 온라인 강의가 유행이었고, 이를 바탕으로 프로젝트를 만들어 보기로 했다.</w:t>
+      </w:r>
+    </w:p>
+    <w:p>
+      <w:pPr>
+        <w:jc w:val="both"/>
+        <w:rPr>
+          <w:rFonts w:cs="맑은 고딕"/>
+          <w:lang w:eastAsia="ko-KR"/>
+        </w:rPr>
+      </w:pPr>
+      <w:r>
+        <w:rPr>
+          <w:rFonts w:cs="맑은 고딕" w:hint="eastAsia"/>
+          <w:lang w:eastAsia="ko-KR"/>
+        </w:rPr>
+        <w:t>직접</w:t>
+      </w:r>
+      <w:r>
+        <w:rPr>
+          <w:rFonts w:cs="맑은 고딕"/>
+          <w:lang w:eastAsia="ko-KR"/>
+        </w:rPr>
+        <w:t xml:space="preserve"> 게임을 해 보고 주변 사람들에게 어떤 것이 더 낫다고 느끼는지 물어 정보를 모았다. 이를 바탕으로 기능을 정하고, 막바지까지 고티어와 저티어, 아이템에 대해 고민했으며, 로컬에서 앱을 직접 테스트하면서 작은 아이디어들을 더했다. 넣고 싶은 아이디어는 아직 많지만 시간 제한 때문에 범위를 줄였다. AI는 나를 돕는 도구로 사용했고 무엇이 있는지 함께 논의하는 데 활용했다.</w:t>
+      </w:r>
+    </w:p>
+    <w:p>
+      <w:pPr>
+        <w:jc w:val="both"/>
+        <w:rPr>
+          <w:rFonts w:cs="맑은 고딕"/>
+          <w:lang w:eastAsia="ko-KR"/>
+        </w:rPr>
+      </w:pPr>
+      <w:r>
+        <w:rPr>
+          <w:rFonts w:cs="맑은 고딕"/>
+          <w:lang w:eastAsia="ko-KR"/>
+        </w:rPr>
+        <w:t>이전에 로컬에서 구현했던 프로그램과 자료를 잃은 뒤 현재 환경에서 재구성하였다. 기억에 남은 과거 결과와 이번에 파일·로그로 확인할 수 있는 결과를 분리하는 일이 중요했다. AI 코딩 도구의 도움을 받아 기능과 검사를 확장했고, 정상 터미널에서 전체 검사를 실행해 동작을 확인하였다. 예측 숫자 하나를 보여 주는 것보다 자료의 출처, 조언이 나온 근거, 실제로 확인하지 못한 한계를 설명해야 한다는 점을 경험하였다.</w:t>
+      </w:r>
+    </w:p>
+    <w:p>
+      <w:pPr>
+        <w:jc w:val="both"/>
+        <w:rPr>
+          <w:rFonts w:cs="맑은 고딕"/>
+          <w:lang w:eastAsia="ko-KR"/>
+        </w:rPr>
+      </w:pPr>
+      <w:r>
+        <w:rPr>
+          <w:rFonts w:cs="맑은 고딕" w:hint="eastAsia"/>
+          <w:lang w:eastAsia="ko-KR"/>
+        </w:rPr>
+        <w:t>가장</w:t>
+      </w:r>
+      <w:r>
+        <w:rPr>
+          <w:rFonts w:cs="맑은 고딕"/>
+          <w:lang w:eastAsia="ko-KR"/>
+        </w:rPr>
+        <w:t xml:space="preserve"> 어려웠던 점은 이전 컴퓨터를 잃은 것이다. GitHub에 저장했어야 했는데 커밋하는 것을 잊었고, 이는 내 큰 실수였다. 해야 할 일이 많아 프로젝트를 마치는 데에도 꽤 오랜 시간이 걸렸다. 그사이 DeepLoL이 나오고 GGQ가 커졌으며 OP.GG도 크게 좋아져서, 예전에는 그들에게 없던 내 아이디어 중 일부가 현재 버전에 이미 들어가 있었다. 이 점이 특히 어려웠다.</w:t>
+      </w:r>
+    </w:p>
+    <w:p>
+      <w:pPr>
+        <w:jc w:val="both"/>
+        <w:rPr>
+          <w:lang w:eastAsia="ko-KR"/>
+        </w:rPr>
+      </w:pPr>
+      <w:r>
+        <w:rPr>
+          <w:rFonts w:cs="맑은 고딕" w:hint="eastAsia"/>
+          <w:lang w:eastAsia="ko-KR"/>
+        </w:rPr>
+        <w:t>이번</w:t>
+      </w:r>
+      <w:r>
+        <w:rPr>
+          <w:rFonts w:cs="맑은 고딕"/>
+          <w:lang w:eastAsia="ko-KR"/>
+        </w:rPr>
+        <w:t xml:space="preserve"> 작품을 통해 꾸준함과 끈기가 없으면 안 된다는 것을 배웠다. 프로그래밍</w:t>
+      </w:r>
+      <w:r>
+        <w:rPr>
+          <w:rFonts w:cs="맑은 고딕" w:hint="eastAsia"/>
+          <w:lang w:eastAsia="ko-KR"/>
+        </w:rPr>
+        <w:t>에서는</w:t>
+      </w:r>
+      <w:r>
+        <w:rPr>
+          <w:rFonts w:cs="맑은 고딕"/>
+          <w:lang w:eastAsia="ko-KR"/>
+        </w:rPr>
+        <w:t xml:space="preserve"> 결국 속도와 사람들이 무엇을 좋아하는지 살피는 것이 중요했다. 사람마다 필요로 하고 원하는 것과 보는 관점이 다르기 때문에, 항상 열린 자세로 새로운 것을 찾고 계속 업데이트해야 한다고 느꼈다.</w:t>
       </w:r>
     </w:p>
     <w:p>

</xml_diff>